<commit_message>
formulario y subir material
</commit_message>
<xml_diff>
--- a/Formularios LOGT/Alejandra Sierra.docx
+++ b/Formularios LOGT/Alejandra Sierra.docx
@@ -270,14 +270,8 @@
             </w:tcMar>
           </w:tcPr>
           <w:p>
-            <w:pPr>
-              <w:rPr>
-                <w:b/>
-                <w:bCs/>
-              </w:rPr>
-            </w:pPr>
-            <w:r>
-              <w:t>13/02</w:t>
+            <w:r>
+              <w:t>25/02</w:t>
             </w:r>
           </w:p>
         </w:tc>
@@ -299,12 +293,6 @@
             </w:tcMar>
           </w:tcPr>
           <w:p>
-            <w:pPr>
-              <w:rPr>
-                <w:b/>
-                <w:bCs/>
-              </w:rPr>
-            </w:pPr>
             <w:r>
               <w:t>22:00</w:t>
             </w:r>
@@ -328,14 +316,8 @@
             </w:tcMar>
           </w:tcPr>
           <w:p>
-            <w:pPr>
-              <w:rPr>
-                <w:b/>
-                <w:bCs/>
-              </w:rPr>
-            </w:pPr>
-            <w:r>
-              <w:t>23:00</w:t>
+            <w:r>
+              <w:t>23:15</w:t>
             </w:r>
           </w:p>
         </w:tc>
@@ -357,14 +339,8 @@
             </w:tcMar>
           </w:tcPr>
           <w:p>
-            <w:pPr>
-              <w:rPr>
-                <w:b/>
-                <w:bCs/>
-              </w:rPr>
-            </w:pPr>
-            <w:r>
-              <w:t>-</w:t>
+            <w:r>
+              <w:t>15min</w:t>
             </w:r>
           </w:p>
         </w:tc>
@@ -386,12 +362,6 @@
             </w:tcMar>
           </w:tcPr>
           <w:p>
-            <w:pPr>
-              <w:rPr>
-                <w:b/>
-                <w:bCs/>
-              </w:rPr>
-            </w:pPr>
             <w:r>
               <w:t>1h</w:t>
             </w:r>
@@ -415,14 +385,8 @@
             </w:tcMar>
           </w:tcPr>
           <w:p>
-            <w:pPr>
-              <w:rPr>
-                <w:b/>
-                <w:bCs/>
-              </w:rPr>
-            </w:pPr>
-            <w:r>
-              <w:t>Avances 2</w:t>
+            <w:r>
+              <w:t>Corte 2</w:t>
             </w:r>
           </w:p>
         </w:tc>
@@ -444,15 +408,14 @@
             </w:tcMar>
           </w:tcPr>
           <w:p>
-            <w:pPr>
-              <w:rPr>
-                <w:b/>
-                <w:bCs/>
-              </w:rPr>
-            </w:pPr>
-            <w:r>
-              <w:t>Ordenar el repositorio</w:t>
-            </w:r>
+            <w:r>
+              <w:t xml:space="preserve">Revisión del documento, correcciones finales y subir todo al </w:t>
+            </w:r>
+            <w:proofErr w:type="spellStart"/>
+            <w:r>
+              <w:t>git</w:t>
+            </w:r>
+            <w:proofErr w:type="spellEnd"/>
           </w:p>
         </w:tc>
       </w:tr>
@@ -478,14 +441,8 @@
             </w:tcMar>
           </w:tcPr>
           <w:p>
-            <w:pPr>
-              <w:rPr>
-                <w:b/>
-                <w:bCs/>
-              </w:rPr>
-            </w:pPr>
-            <w:r>
-              <w:t>9/02</w:t>
+            <w:r>
+              <w:t>24/02</w:t>
             </w:r>
           </w:p>
         </w:tc>
@@ -507,14 +464,11 @@
             </w:tcMar>
           </w:tcPr>
           <w:p>
-            <w:pPr>
-              <w:rPr>
-                <w:b/>
-                <w:bCs/>
-              </w:rPr>
-            </w:pPr>
-            <w:r>
-              <w:t>21:30</w:t>
+            <w:r>
+              <w:t>22</w:t>
+            </w:r>
+            <w:r>
+              <w:t>:30</w:t>
             </w:r>
           </w:p>
         </w:tc>
@@ -536,14 +490,8 @@
             </w:tcMar>
           </w:tcPr>
           <w:p>
-            <w:pPr>
-              <w:rPr>
-                <w:b/>
-                <w:bCs/>
-              </w:rPr>
-            </w:pPr>
-            <w:r>
-              <w:t>23:00</w:t>
+            <w:r>
+              <w:t>23:15</w:t>
             </w:r>
           </w:p>
         </w:tc>
@@ -565,12 +513,6 @@
             </w:tcMar>
           </w:tcPr>
           <w:p>
-            <w:pPr>
-              <w:rPr>
-                <w:b/>
-                <w:bCs/>
-              </w:rPr>
-            </w:pPr>
             <w:r>
               <w:t>-</w:t>
             </w:r>
@@ -594,14 +536,8 @@
             </w:tcMar>
           </w:tcPr>
           <w:p>
-            <w:pPr>
-              <w:rPr>
-                <w:b/>
-                <w:bCs/>
-              </w:rPr>
-            </w:pPr>
-            <w:r>
-              <w:t>1h 30min</w:t>
+            <w:r>
+              <w:t>45min</w:t>
             </w:r>
           </w:p>
         </w:tc>
@@ -623,14 +559,8 @@
             </w:tcMar>
           </w:tcPr>
           <w:p>
-            <w:pPr>
-              <w:rPr>
-                <w:b/>
-                <w:bCs/>
-              </w:rPr>
-            </w:pPr>
-            <w:r>
-              <w:t>Avances 2</w:t>
+            <w:r>
+              <w:t>Corte 2</w:t>
             </w:r>
           </w:p>
         </w:tc>
@@ -652,14 +582,8 @@
             </w:tcMar>
           </w:tcPr>
           <w:p>
-            <w:pPr>
-              <w:rPr>
-                <w:b/>
-                <w:bCs/>
-              </w:rPr>
-            </w:pPr>
-            <w:r>
-              <w:t xml:space="preserve">Anotar el proceso de </w:t>
+            <w:r>
+              <w:t xml:space="preserve">Mejorar redacción </w:t>
             </w:r>
             <w:proofErr w:type="spellStart"/>
             <w:r>
@@ -675,7 +599,7 @@
             </w:r>
             <w:proofErr w:type="spellEnd"/>
             <w:r>
-              <w:t xml:space="preserve"> con las ideas de cada ronda</w:t>
+              <w:t xml:space="preserve"> y realizar presentación</w:t>
             </w:r>
           </w:p>
         </w:tc>
@@ -693,6 +617,7 @@
               <w:bottom w:val="single" w:sz="4" w:space="0" w:color="000000"/>
               <w:right w:val="single" w:sz="4" w:space="0" w:color="000000"/>
             </w:tcBorders>
+            <w:shd w:val="clear" w:color="auto" w:fill="A5C9EB" w:themeFill="text2" w:themeFillTint="40"/>
             <w:tcMar>
               <w:top w:w="100" w:type="dxa"/>
               <w:left w:w="100" w:type="dxa"/>
@@ -708,19 +633,20 @@
               </w:rPr>
             </w:pPr>
             <w:r>
-              <w:t>1/02</w:t>
-            </w:r>
-          </w:p>
-        </w:tc>
-        <w:tc>
-          <w:tcPr>
-            <w:tcW w:w="0" w:type="auto"/>
-            <w:tcBorders>
-              <w:top w:val="single" w:sz="4" w:space="0" w:color="000000"/>
-              <w:left w:val="single" w:sz="4" w:space="0" w:color="000000"/>
-              <w:bottom w:val="single" w:sz="4" w:space="0" w:color="000000"/>
-              <w:right w:val="single" w:sz="4" w:space="0" w:color="000000"/>
-            </w:tcBorders>
+              <w:t>13/02</w:t>
+            </w:r>
+          </w:p>
+        </w:tc>
+        <w:tc>
+          <w:tcPr>
+            <w:tcW w:w="0" w:type="auto"/>
+            <w:tcBorders>
+              <w:top w:val="single" w:sz="4" w:space="0" w:color="000000"/>
+              <w:left w:val="single" w:sz="4" w:space="0" w:color="000000"/>
+              <w:bottom w:val="single" w:sz="4" w:space="0" w:color="000000"/>
+              <w:right w:val="single" w:sz="4" w:space="0" w:color="000000"/>
+            </w:tcBorders>
+            <w:shd w:val="clear" w:color="auto" w:fill="A5C9EB" w:themeFill="text2" w:themeFillTint="40"/>
             <w:tcMar>
               <w:top w:w="100" w:type="dxa"/>
               <w:left w:w="100" w:type="dxa"/>
@@ -736,19 +662,20 @@
               </w:rPr>
             </w:pPr>
             <w:r>
-              <w:t>13:00</w:t>
-            </w:r>
-          </w:p>
-        </w:tc>
-        <w:tc>
-          <w:tcPr>
-            <w:tcW w:w="0" w:type="auto"/>
-            <w:tcBorders>
-              <w:top w:val="single" w:sz="4" w:space="0" w:color="000000"/>
-              <w:left w:val="single" w:sz="4" w:space="0" w:color="000000"/>
-              <w:bottom w:val="single" w:sz="4" w:space="0" w:color="000000"/>
-              <w:right w:val="single" w:sz="4" w:space="0" w:color="000000"/>
-            </w:tcBorders>
+              <w:t>22:00</w:t>
+            </w:r>
+          </w:p>
+        </w:tc>
+        <w:tc>
+          <w:tcPr>
+            <w:tcW w:w="0" w:type="auto"/>
+            <w:tcBorders>
+              <w:top w:val="single" w:sz="4" w:space="0" w:color="000000"/>
+              <w:left w:val="single" w:sz="4" w:space="0" w:color="000000"/>
+              <w:bottom w:val="single" w:sz="4" w:space="0" w:color="000000"/>
+              <w:right w:val="single" w:sz="4" w:space="0" w:color="000000"/>
+            </w:tcBorders>
+            <w:shd w:val="clear" w:color="auto" w:fill="A5C9EB" w:themeFill="text2" w:themeFillTint="40"/>
             <w:tcMar>
               <w:top w:w="100" w:type="dxa"/>
               <w:left w:w="100" w:type="dxa"/>
@@ -764,19 +691,20 @@
               </w:rPr>
             </w:pPr>
             <w:r>
-              <w:t>14:00</w:t>
-            </w:r>
-          </w:p>
-        </w:tc>
-        <w:tc>
-          <w:tcPr>
-            <w:tcW w:w="0" w:type="auto"/>
-            <w:tcBorders>
-              <w:top w:val="single" w:sz="4" w:space="0" w:color="000000"/>
-              <w:left w:val="single" w:sz="4" w:space="0" w:color="000000"/>
-              <w:bottom w:val="single" w:sz="4" w:space="0" w:color="000000"/>
-              <w:right w:val="single" w:sz="4" w:space="0" w:color="000000"/>
-            </w:tcBorders>
+              <w:t>23:00</w:t>
+            </w:r>
+          </w:p>
+        </w:tc>
+        <w:tc>
+          <w:tcPr>
+            <w:tcW w:w="0" w:type="auto"/>
+            <w:tcBorders>
+              <w:top w:val="single" w:sz="4" w:space="0" w:color="000000"/>
+              <w:left w:val="single" w:sz="4" w:space="0" w:color="000000"/>
+              <w:bottom w:val="single" w:sz="4" w:space="0" w:color="000000"/>
+              <w:right w:val="single" w:sz="4" w:space="0" w:color="000000"/>
+            </w:tcBorders>
+            <w:shd w:val="clear" w:color="auto" w:fill="A5C9EB" w:themeFill="text2" w:themeFillTint="40"/>
             <w:tcMar>
               <w:top w:w="100" w:type="dxa"/>
               <w:left w:w="100" w:type="dxa"/>
@@ -791,17 +719,21 @@
                 <w:bCs/>
               </w:rPr>
             </w:pPr>
-          </w:p>
-        </w:tc>
-        <w:tc>
-          <w:tcPr>
-            <w:tcW w:w="0" w:type="auto"/>
-            <w:tcBorders>
-              <w:top w:val="single" w:sz="4" w:space="0" w:color="000000"/>
-              <w:left w:val="single" w:sz="4" w:space="0" w:color="000000"/>
-              <w:bottom w:val="single" w:sz="4" w:space="0" w:color="000000"/>
-              <w:right w:val="single" w:sz="4" w:space="0" w:color="000000"/>
-            </w:tcBorders>
+            <w:r>
+              <w:t>-</w:t>
+            </w:r>
+          </w:p>
+        </w:tc>
+        <w:tc>
+          <w:tcPr>
+            <w:tcW w:w="0" w:type="auto"/>
+            <w:tcBorders>
+              <w:top w:val="single" w:sz="4" w:space="0" w:color="000000"/>
+              <w:left w:val="single" w:sz="4" w:space="0" w:color="000000"/>
+              <w:bottom w:val="single" w:sz="4" w:space="0" w:color="000000"/>
+              <w:right w:val="single" w:sz="4" w:space="0" w:color="000000"/>
+            </w:tcBorders>
+            <w:shd w:val="clear" w:color="auto" w:fill="A5C9EB" w:themeFill="text2" w:themeFillTint="40"/>
             <w:tcMar>
               <w:top w:w="100" w:type="dxa"/>
               <w:left w:w="100" w:type="dxa"/>
@@ -830,6 +762,7 @@
               <w:bottom w:val="single" w:sz="4" w:space="0" w:color="000000"/>
               <w:right w:val="single" w:sz="4" w:space="0" w:color="000000"/>
             </w:tcBorders>
+            <w:shd w:val="clear" w:color="auto" w:fill="A5C9EB" w:themeFill="text2" w:themeFillTint="40"/>
             <w:tcMar>
               <w:top w:w="100" w:type="dxa"/>
               <w:left w:w="100" w:type="dxa"/>
@@ -845,7 +778,7 @@
               </w:rPr>
             </w:pPr>
             <w:r>
-              <w:t>Corte 1</w:t>
+              <w:t>Avances 2</w:t>
             </w:r>
           </w:p>
         </w:tc>
@@ -858,6 +791,7 @@
               <w:bottom w:val="single" w:sz="4" w:space="0" w:color="000000"/>
               <w:right w:val="single" w:sz="4" w:space="0" w:color="000000"/>
             </w:tcBorders>
+            <w:shd w:val="clear" w:color="auto" w:fill="A5C9EB" w:themeFill="text2" w:themeFillTint="40"/>
             <w:tcMar>
               <w:top w:w="100" w:type="dxa"/>
               <w:left w:w="100" w:type="dxa"/>
@@ -873,7 +807,7 @@
               </w:rPr>
             </w:pPr>
             <w:r>
-              <w:t>Revisión del documento, elaboración del resumen, y de la presentación para clase.</w:t>
+              <w:t>Ordenar el repositorio</w:t>
             </w:r>
           </w:p>
         </w:tc>
@@ -891,6 +825,428 @@
               <w:bottom w:val="single" w:sz="4" w:space="0" w:color="000000"/>
               <w:right w:val="single" w:sz="4" w:space="0" w:color="000000"/>
             </w:tcBorders>
+            <w:shd w:val="clear" w:color="auto" w:fill="A5C9EB" w:themeFill="text2" w:themeFillTint="40"/>
+            <w:tcMar>
+              <w:top w:w="100" w:type="dxa"/>
+              <w:left w:w="100" w:type="dxa"/>
+              <w:bottom w:w="100" w:type="dxa"/>
+              <w:right w:w="100" w:type="dxa"/>
+            </w:tcMar>
+          </w:tcPr>
+          <w:p>
+            <w:pPr>
+              <w:rPr>
+                <w:b/>
+                <w:bCs/>
+              </w:rPr>
+            </w:pPr>
+            <w:r>
+              <w:t>9/02</w:t>
+            </w:r>
+          </w:p>
+        </w:tc>
+        <w:tc>
+          <w:tcPr>
+            <w:tcW w:w="0" w:type="auto"/>
+            <w:tcBorders>
+              <w:top w:val="single" w:sz="4" w:space="0" w:color="000000"/>
+              <w:left w:val="single" w:sz="4" w:space="0" w:color="000000"/>
+              <w:bottom w:val="single" w:sz="4" w:space="0" w:color="000000"/>
+              <w:right w:val="single" w:sz="4" w:space="0" w:color="000000"/>
+            </w:tcBorders>
+            <w:shd w:val="clear" w:color="auto" w:fill="A5C9EB" w:themeFill="text2" w:themeFillTint="40"/>
+            <w:tcMar>
+              <w:top w:w="100" w:type="dxa"/>
+              <w:left w:w="100" w:type="dxa"/>
+              <w:bottom w:w="100" w:type="dxa"/>
+              <w:right w:w="100" w:type="dxa"/>
+            </w:tcMar>
+          </w:tcPr>
+          <w:p>
+            <w:pPr>
+              <w:rPr>
+                <w:b/>
+                <w:bCs/>
+              </w:rPr>
+            </w:pPr>
+            <w:r>
+              <w:t>21:30</w:t>
+            </w:r>
+          </w:p>
+        </w:tc>
+        <w:tc>
+          <w:tcPr>
+            <w:tcW w:w="0" w:type="auto"/>
+            <w:tcBorders>
+              <w:top w:val="single" w:sz="4" w:space="0" w:color="000000"/>
+              <w:left w:val="single" w:sz="4" w:space="0" w:color="000000"/>
+              <w:bottom w:val="single" w:sz="4" w:space="0" w:color="000000"/>
+              <w:right w:val="single" w:sz="4" w:space="0" w:color="000000"/>
+            </w:tcBorders>
+            <w:shd w:val="clear" w:color="auto" w:fill="A5C9EB" w:themeFill="text2" w:themeFillTint="40"/>
+            <w:tcMar>
+              <w:top w:w="100" w:type="dxa"/>
+              <w:left w:w="100" w:type="dxa"/>
+              <w:bottom w:w="100" w:type="dxa"/>
+              <w:right w:w="100" w:type="dxa"/>
+            </w:tcMar>
+          </w:tcPr>
+          <w:p>
+            <w:pPr>
+              <w:rPr>
+                <w:b/>
+                <w:bCs/>
+              </w:rPr>
+            </w:pPr>
+            <w:r>
+              <w:t>23:00</w:t>
+            </w:r>
+          </w:p>
+        </w:tc>
+        <w:tc>
+          <w:tcPr>
+            <w:tcW w:w="0" w:type="auto"/>
+            <w:tcBorders>
+              <w:top w:val="single" w:sz="4" w:space="0" w:color="000000"/>
+              <w:left w:val="single" w:sz="4" w:space="0" w:color="000000"/>
+              <w:bottom w:val="single" w:sz="4" w:space="0" w:color="000000"/>
+              <w:right w:val="single" w:sz="4" w:space="0" w:color="000000"/>
+            </w:tcBorders>
+            <w:shd w:val="clear" w:color="auto" w:fill="A5C9EB" w:themeFill="text2" w:themeFillTint="40"/>
+            <w:tcMar>
+              <w:top w:w="100" w:type="dxa"/>
+              <w:left w:w="100" w:type="dxa"/>
+              <w:bottom w:w="100" w:type="dxa"/>
+              <w:right w:w="100" w:type="dxa"/>
+            </w:tcMar>
+          </w:tcPr>
+          <w:p>
+            <w:pPr>
+              <w:rPr>
+                <w:b/>
+                <w:bCs/>
+              </w:rPr>
+            </w:pPr>
+            <w:r>
+              <w:t>-</w:t>
+            </w:r>
+          </w:p>
+        </w:tc>
+        <w:tc>
+          <w:tcPr>
+            <w:tcW w:w="0" w:type="auto"/>
+            <w:tcBorders>
+              <w:top w:val="single" w:sz="4" w:space="0" w:color="000000"/>
+              <w:left w:val="single" w:sz="4" w:space="0" w:color="000000"/>
+              <w:bottom w:val="single" w:sz="4" w:space="0" w:color="000000"/>
+              <w:right w:val="single" w:sz="4" w:space="0" w:color="000000"/>
+            </w:tcBorders>
+            <w:shd w:val="clear" w:color="auto" w:fill="A5C9EB" w:themeFill="text2" w:themeFillTint="40"/>
+            <w:tcMar>
+              <w:top w:w="100" w:type="dxa"/>
+              <w:left w:w="100" w:type="dxa"/>
+              <w:bottom w:w="100" w:type="dxa"/>
+              <w:right w:w="100" w:type="dxa"/>
+            </w:tcMar>
+          </w:tcPr>
+          <w:p>
+            <w:pPr>
+              <w:rPr>
+                <w:b/>
+                <w:bCs/>
+              </w:rPr>
+            </w:pPr>
+            <w:r>
+              <w:t>1h 30min</w:t>
+            </w:r>
+          </w:p>
+        </w:tc>
+        <w:tc>
+          <w:tcPr>
+            <w:tcW w:w="1213" w:type="dxa"/>
+            <w:tcBorders>
+              <w:top w:val="single" w:sz="4" w:space="0" w:color="000000"/>
+              <w:left w:val="single" w:sz="4" w:space="0" w:color="000000"/>
+              <w:bottom w:val="single" w:sz="4" w:space="0" w:color="000000"/>
+              <w:right w:val="single" w:sz="4" w:space="0" w:color="000000"/>
+            </w:tcBorders>
+            <w:shd w:val="clear" w:color="auto" w:fill="A5C9EB" w:themeFill="text2" w:themeFillTint="40"/>
+            <w:tcMar>
+              <w:top w:w="100" w:type="dxa"/>
+              <w:left w:w="100" w:type="dxa"/>
+              <w:bottom w:w="100" w:type="dxa"/>
+              <w:right w:w="100" w:type="dxa"/>
+            </w:tcMar>
+          </w:tcPr>
+          <w:p>
+            <w:pPr>
+              <w:rPr>
+                <w:b/>
+                <w:bCs/>
+              </w:rPr>
+            </w:pPr>
+            <w:r>
+              <w:t>Avances 2</w:t>
+            </w:r>
+          </w:p>
+        </w:tc>
+        <w:tc>
+          <w:tcPr>
+            <w:tcW w:w="2312" w:type="dxa"/>
+            <w:tcBorders>
+              <w:top w:val="single" w:sz="4" w:space="0" w:color="000000"/>
+              <w:left w:val="single" w:sz="4" w:space="0" w:color="000000"/>
+              <w:bottom w:val="single" w:sz="4" w:space="0" w:color="000000"/>
+              <w:right w:val="single" w:sz="4" w:space="0" w:color="000000"/>
+            </w:tcBorders>
+            <w:shd w:val="clear" w:color="auto" w:fill="A5C9EB" w:themeFill="text2" w:themeFillTint="40"/>
+            <w:tcMar>
+              <w:top w:w="100" w:type="dxa"/>
+              <w:left w:w="100" w:type="dxa"/>
+              <w:bottom w:w="100" w:type="dxa"/>
+              <w:right w:w="100" w:type="dxa"/>
+            </w:tcMar>
+          </w:tcPr>
+          <w:p>
+            <w:pPr>
+              <w:rPr>
+                <w:b/>
+                <w:bCs/>
+              </w:rPr>
+            </w:pPr>
+            <w:r>
+              <w:t xml:space="preserve">Anotar el proceso de </w:t>
+            </w:r>
+            <w:proofErr w:type="spellStart"/>
+            <w:r>
+              <w:t>design</w:t>
+            </w:r>
+            <w:proofErr w:type="spellEnd"/>
+            <w:r>
+              <w:t xml:space="preserve"> </w:t>
+            </w:r>
+            <w:proofErr w:type="spellStart"/>
+            <w:r>
+              <w:t>studio</w:t>
+            </w:r>
+            <w:proofErr w:type="spellEnd"/>
+            <w:r>
+              <w:t xml:space="preserve"> con las ideas de cada ronda</w:t>
+            </w:r>
+          </w:p>
+        </w:tc>
+      </w:tr>
+      <w:tr>
+        <w:trPr>
+          <w:trHeight w:val="500"/>
+        </w:trPr>
+        <w:tc>
+          <w:tcPr>
+            <w:tcW w:w="0" w:type="auto"/>
+            <w:tcBorders>
+              <w:top w:val="single" w:sz="4" w:space="0" w:color="000000"/>
+              <w:left w:val="single" w:sz="4" w:space="0" w:color="000000"/>
+              <w:bottom w:val="single" w:sz="4" w:space="0" w:color="000000"/>
+              <w:right w:val="single" w:sz="4" w:space="0" w:color="000000"/>
+            </w:tcBorders>
+            <w:tcMar>
+              <w:top w:w="100" w:type="dxa"/>
+              <w:left w:w="100" w:type="dxa"/>
+              <w:bottom w:w="100" w:type="dxa"/>
+              <w:right w:w="100" w:type="dxa"/>
+            </w:tcMar>
+          </w:tcPr>
+          <w:p>
+            <w:pPr>
+              <w:rPr>
+                <w:b/>
+                <w:bCs/>
+              </w:rPr>
+            </w:pPr>
+            <w:r>
+              <w:t>1/02</w:t>
+            </w:r>
+          </w:p>
+        </w:tc>
+        <w:tc>
+          <w:tcPr>
+            <w:tcW w:w="0" w:type="auto"/>
+            <w:tcBorders>
+              <w:top w:val="single" w:sz="4" w:space="0" w:color="000000"/>
+              <w:left w:val="single" w:sz="4" w:space="0" w:color="000000"/>
+              <w:bottom w:val="single" w:sz="4" w:space="0" w:color="000000"/>
+              <w:right w:val="single" w:sz="4" w:space="0" w:color="000000"/>
+            </w:tcBorders>
+            <w:tcMar>
+              <w:top w:w="100" w:type="dxa"/>
+              <w:left w:w="100" w:type="dxa"/>
+              <w:bottom w:w="100" w:type="dxa"/>
+              <w:right w:w="100" w:type="dxa"/>
+            </w:tcMar>
+          </w:tcPr>
+          <w:p>
+            <w:pPr>
+              <w:rPr>
+                <w:b/>
+                <w:bCs/>
+              </w:rPr>
+            </w:pPr>
+            <w:r>
+              <w:t>13:00</w:t>
+            </w:r>
+          </w:p>
+        </w:tc>
+        <w:tc>
+          <w:tcPr>
+            <w:tcW w:w="0" w:type="auto"/>
+            <w:tcBorders>
+              <w:top w:val="single" w:sz="4" w:space="0" w:color="000000"/>
+              <w:left w:val="single" w:sz="4" w:space="0" w:color="000000"/>
+              <w:bottom w:val="single" w:sz="4" w:space="0" w:color="000000"/>
+              <w:right w:val="single" w:sz="4" w:space="0" w:color="000000"/>
+            </w:tcBorders>
+            <w:tcMar>
+              <w:top w:w="100" w:type="dxa"/>
+              <w:left w:w="100" w:type="dxa"/>
+              <w:bottom w:w="100" w:type="dxa"/>
+              <w:right w:w="100" w:type="dxa"/>
+            </w:tcMar>
+          </w:tcPr>
+          <w:p>
+            <w:pPr>
+              <w:rPr>
+                <w:b/>
+                <w:bCs/>
+              </w:rPr>
+            </w:pPr>
+            <w:r>
+              <w:t>14:00</w:t>
+            </w:r>
+          </w:p>
+        </w:tc>
+        <w:tc>
+          <w:tcPr>
+            <w:tcW w:w="0" w:type="auto"/>
+            <w:tcBorders>
+              <w:top w:val="single" w:sz="4" w:space="0" w:color="000000"/>
+              <w:left w:val="single" w:sz="4" w:space="0" w:color="000000"/>
+              <w:bottom w:val="single" w:sz="4" w:space="0" w:color="000000"/>
+              <w:right w:val="single" w:sz="4" w:space="0" w:color="000000"/>
+            </w:tcBorders>
+            <w:tcMar>
+              <w:top w:w="100" w:type="dxa"/>
+              <w:left w:w="100" w:type="dxa"/>
+              <w:bottom w:w="100" w:type="dxa"/>
+              <w:right w:w="100" w:type="dxa"/>
+            </w:tcMar>
+          </w:tcPr>
+          <w:p>
+            <w:pPr>
+              <w:rPr>
+                <w:b/>
+                <w:bCs/>
+              </w:rPr>
+            </w:pPr>
+          </w:p>
+        </w:tc>
+        <w:tc>
+          <w:tcPr>
+            <w:tcW w:w="0" w:type="auto"/>
+            <w:tcBorders>
+              <w:top w:val="single" w:sz="4" w:space="0" w:color="000000"/>
+              <w:left w:val="single" w:sz="4" w:space="0" w:color="000000"/>
+              <w:bottom w:val="single" w:sz="4" w:space="0" w:color="000000"/>
+              <w:right w:val="single" w:sz="4" w:space="0" w:color="000000"/>
+            </w:tcBorders>
+            <w:tcMar>
+              <w:top w:w="100" w:type="dxa"/>
+              <w:left w:w="100" w:type="dxa"/>
+              <w:bottom w:w="100" w:type="dxa"/>
+              <w:right w:w="100" w:type="dxa"/>
+            </w:tcMar>
+          </w:tcPr>
+          <w:p>
+            <w:pPr>
+              <w:rPr>
+                <w:b/>
+                <w:bCs/>
+              </w:rPr>
+            </w:pPr>
+            <w:r>
+              <w:t>1h</w:t>
+            </w:r>
+          </w:p>
+        </w:tc>
+        <w:tc>
+          <w:tcPr>
+            <w:tcW w:w="1213" w:type="dxa"/>
+            <w:tcBorders>
+              <w:top w:val="single" w:sz="4" w:space="0" w:color="000000"/>
+              <w:left w:val="single" w:sz="4" w:space="0" w:color="000000"/>
+              <w:bottom w:val="single" w:sz="4" w:space="0" w:color="000000"/>
+              <w:right w:val="single" w:sz="4" w:space="0" w:color="000000"/>
+            </w:tcBorders>
+            <w:tcMar>
+              <w:top w:w="100" w:type="dxa"/>
+              <w:left w:w="100" w:type="dxa"/>
+              <w:bottom w:w="100" w:type="dxa"/>
+              <w:right w:w="100" w:type="dxa"/>
+            </w:tcMar>
+          </w:tcPr>
+          <w:p>
+            <w:pPr>
+              <w:rPr>
+                <w:b/>
+                <w:bCs/>
+              </w:rPr>
+            </w:pPr>
+            <w:r>
+              <w:t>Corte 1</w:t>
+            </w:r>
+          </w:p>
+        </w:tc>
+        <w:tc>
+          <w:tcPr>
+            <w:tcW w:w="2312" w:type="dxa"/>
+            <w:tcBorders>
+              <w:top w:val="single" w:sz="4" w:space="0" w:color="000000"/>
+              <w:left w:val="single" w:sz="4" w:space="0" w:color="000000"/>
+              <w:bottom w:val="single" w:sz="4" w:space="0" w:color="000000"/>
+              <w:right w:val="single" w:sz="4" w:space="0" w:color="000000"/>
+            </w:tcBorders>
+            <w:tcMar>
+              <w:top w:w="100" w:type="dxa"/>
+              <w:left w:w="100" w:type="dxa"/>
+              <w:bottom w:w="100" w:type="dxa"/>
+              <w:right w:w="100" w:type="dxa"/>
+            </w:tcMar>
+          </w:tcPr>
+          <w:p>
+            <w:pPr>
+              <w:rPr>
+                <w:b/>
+                <w:bCs/>
+              </w:rPr>
+            </w:pPr>
+            <w:r>
+              <w:t>Revisión del documento, elaboración del resumen, y de la presentación para clase.</w:t>
+            </w:r>
+          </w:p>
+        </w:tc>
+      </w:tr>
+      <w:tr>
+        <w:trPr>
+          <w:trHeight w:val="500"/>
+        </w:trPr>
+        <w:tc>
+          <w:tcPr>
+            <w:tcW w:w="0" w:type="auto"/>
+            <w:tcBorders>
+              <w:top w:val="single" w:sz="4" w:space="0" w:color="000000"/>
+              <w:left w:val="single" w:sz="4" w:space="0" w:color="000000"/>
+              <w:bottom w:val="single" w:sz="4" w:space="0" w:color="000000"/>
+              <w:right w:val="single" w:sz="4" w:space="0" w:color="000000"/>
+            </w:tcBorders>
             <w:tcMar>
               <w:top w:w="100" w:type="dxa"/>
               <w:left w:w="100" w:type="dxa"/>
@@ -1102,6 +1458,7 @@
           </w:tcPr>
           <w:p>
             <w:r>
+              <w:lastRenderedPageBreak/>
               <w:t>22/01</w:t>
             </w:r>
           </w:p>

</xml_diff>